<commit_message>
Psicología Evolutiva: cursada y fichas de C21-C22 con las diapositivas
Las versiones de cursada de Personalidad (C21) y Afrontamiento (C22) eran
provisorias (solo programa). Ahora siguen las diapositivas de la cátedra:
C21 suma medición, temperamento, teorías del género y los seis elementos
de Costa y McCrae; C22 suma los factores de salud mental, Peck, la tabla
de estrategias de los mayores, las críticas al envejecimiento exitoso y
la actividad de Zonas Azules. Fichas de repaso rehechas con diagrama.

Co-Authored-By: Claude Opus 5.5 <noreply@anthropic.com>
</commit_message>
<xml_diff>
--- a/2do Año/Psicología Evolutiva/3_Guias_de_Estudio/C21_Personalidad_Repaso_Guia.docx
+++ b/2do Año/Psicología Evolutiva/3_Guias_de_Estudio/C21_Personalidad_Repaso_Guia.docx
@@ -26,7 +26,7 @@
         <w:t xml:space="preserve"> </w:t>
       </w:r>
       <w:r>
-        <w:t xml:space="preserve">La personalidad adulta combina</w:t>
+        <w:t xml:space="preserve">La personalidad es un patrón distintivo y relativamente estable de pensar, sentir y actuar con el que cada persona se</w:t>
       </w:r>
       <w:r>
         <w:t xml:space="preserve"> </w:t>
@@ -36,10 +36,10 @@
           <w:b/>
           <w:bCs/>
         </w:rPr>
-        <w:t xml:space="preserve">estabilidad y cambio</w:t>
-      </w:r>
-      <w:r>
-        <w:t xml:space="preserve">. Los</w:t>
+        <w:t xml:space="preserve">adapta</w:t>
+      </w:r>
+      <w:r>
+        <w:t xml:space="preserve">; surge de la</w:t>
       </w:r>
       <w:r>
         <w:t xml:space="preserve"> </w:t>
@@ -49,13 +49,10 @@
           <w:b/>
           <w:bCs/>
         </w:rPr>
-        <w:t xml:space="preserve">modelos de rasgos</w:t>
-      </w:r>
-      <w:r>
-        <w:t xml:space="preserve"> </w:t>
-      </w:r>
-      <w:r>
-        <w:t xml:space="preserve">(Costa y McCrae) destacan la estabilidad después de los 30; los</w:t>
+        <w:t xml:space="preserve">interacción entre herencia (temperamento) y ambiente</w:t>
+      </w:r>
+      <w:r>
+        <w:t xml:space="preserve">. Cuatro modelos explican su desarrollo adulto:</w:t>
       </w:r>
       <w:r>
         <w:t xml:space="preserve"> </w:t>
@@ -65,13 +62,13 @@
           <w:b/>
           <w:bCs/>
         </w:rPr>
-        <w:t xml:space="preserve">modelos de etapas</w:t>
+        <w:t xml:space="preserve">rasgos</w:t>
       </w:r>
       <w:r>
         <w:t xml:space="preserve"> </w:t>
       </w:r>
       <w:r>
-        <w:t xml:space="preserve">(Erikson, Vaillant, Levinson), el cambio normativo ligado a la edad; el</w:t>
+        <w:t xml:space="preserve">(casi no cambia),</w:t>
       </w:r>
       <w:r>
         <w:t xml:space="preserve"> </w:t>
@@ -81,13 +78,13 @@
           <w:b/>
           <w:bCs/>
         </w:rPr>
-        <w:t xml:space="preserve">modelo de los acontecimientos de la vida</w:t>
+        <w:t xml:space="preserve">autoconcepto</w:t>
       </w:r>
       <w:r>
         <w:t xml:space="preserve"> </w:t>
       </w:r>
       <w:r>
-        <w:t xml:space="preserve">(Neugarten), el momento en que ocurren los eventos; y el</w:t>
+        <w:t xml:space="preserve">(equilibrio estabilidad-cambio),</w:t>
       </w:r>
       <w:r>
         <w:t xml:space="preserve"> </w:t>
@@ -97,13 +94,29 @@
           <w:b/>
           <w:bCs/>
         </w:rPr>
-        <w:t xml:space="preserve">modelo del autoconcepto</w:t>
+        <w:t xml:space="preserve">etapas</w:t>
       </w:r>
       <w:r>
         <w:t xml:space="preserve"> </w:t>
       </w:r>
       <w:r>
-        <w:t xml:space="preserve">(Whitbourne), el equilibrio entre asimilación y acomodación de la identidad. El</w:t>
+        <w:t xml:space="preserve">(cambio normativo por edad) y</w:t>
+      </w:r>
+      <w:r>
+        <w:t xml:space="preserve"> </w:t>
+      </w:r>
+      <w:r>
+        <w:rPr>
+          <w:b/>
+          <w:bCs/>
+        </w:rPr>
+        <w:t xml:space="preserve">acontecimientos vitales</w:t>
+      </w:r>
+      <w:r>
+        <w:t xml:space="preserve"> </w:t>
+      </w:r>
+      <w:r>
+        <w:t xml:space="preserve">(cambio según el momento de los eventos). En la adultez media los roles de</w:t>
       </w:r>
       <w:r>
         <w:t xml:space="preserve"> </w:t>
@@ -119,7 +132,7 @@
         <w:t xml:space="preserve"> </w:t>
       </w:r>
       <w:r>
-        <w:t xml:space="preserve">modula todo el desarrollo (Papalia et al., 2009b, pp. 399-400, 427-428).</w:t>
+        <w:t xml:space="preserve">tienden a ser más andróginos (Cátedra de Psicología Evolutiva, 2026g, diapositivas 3, 7, 12, 31; Papalia et al., 2009b, pp. 395, 398-400).</w:t>
       </w:r>
     </w:p>
     <w:p>
@@ -129,14 +142,14 @@
       <w:r>
         <w:drawing>
           <wp:inline>
-            <wp:extent cx="5759999" cy="1733877"/>
+            <wp:extent cx="5759999" cy="1983673"/>
             <wp:effectExtent b="0" l="0" r="0" t="0"/>
-            <wp:docPr descr="Diagrama de la guía" title="" id="10" name="Picture"/>
+            <wp:docPr descr="Diagrama 01" title="" id="10" name="Picture"/>
             <a:graphic>
               <a:graphicData uri="http://schemas.openxmlformats.org/drawingml/2006/picture">
                 <pic:pic>
                   <pic:nvPicPr>
-                    <pic:cNvPr descr="C:/Users/Fmendezcasariego/OneDrive/Carpetas/Educación/Universidad/Favaloro/Psicología/2do%20Año/Psicología%20Evolutiva/3_Guias_de_Estudio/_media/C21_Personalidad_01.png" id="11" name="Picture"/>
+                    <pic:cNvPr descr="C:/Users/Fmendezcasariego/OneDrive/Carpetas/Educación/Universidad/Favaloro/Psicología/2do%20Año/Psicología%20Evolutiva/3_Guias_de_Estudio/_media/C21_Personalidad_Repaso_01.png" id="11" name="Picture"/>
                     <pic:cNvPicPr>
                       <a:picLocks noChangeArrowheads="1" noChangeAspect="1"/>
                     </pic:cNvPicPr>
@@ -150,7 +163,7 @@
                   <pic:spPr bwMode="auto">
                     <a:xfrm>
                       <a:off x="0" y="0"/>
-                      <a:ext cx="5759999" cy="1733877"/>
+                      <a:ext cx="5759999" cy="1983673"/>
                     </a:xfrm>
                     <a:prstGeom prst="rect">
                       <a:avLst/>
@@ -187,13 +200,13 @@
           <w:b/>
           <w:bCs/>
         </w:rPr>
-        <w:t xml:space="preserve">P1. Definición y orígenes.</w:t>
+        <w:t xml:space="preserve">P1. Desarrollo de la personalidad.</w:t>
       </w:r>
       <w:r>
         <w:t xml:space="preserve"> </w:t>
       </w:r>
       <w:r>
-        <w:t xml:space="preserve">Patrones distintivos y relativamente constantes de pensar, sentir y comportarse con que cada persona se adapta (Mischel, 1986) (p. 395); medición con inventarios, Q-sort y entrevistas (pp. 397-398); orígenes: temperamento hereditario + experiencia, interacción (pp. 398-399).</w:t>
+        <w:t xml:space="preserve">1) No está fijada al nacer: interacción herencia-ambiente. 2) Temperamento: disposición emocional de base genética (p. 398). 3) Gemelos: el ambiente explica la mitad de la variación (pp. 398-399). 4) Influencia mutua: el temperamento del niño cambia la crianza y viceversa (p. 399).</w:t>
       </w:r>
     </w:p>
     <w:p>
@@ -205,13 +218,13 @@
           <w:b/>
           <w:bCs/>
         </w:rPr>
-        <w:t xml:space="preserve">P2. Rasgos: los cinco factores.</w:t>
+        <w:t xml:space="preserve">P2. Cinco factores.</w:t>
       </w:r>
       <w:r>
         <w:t xml:space="preserve"> </w:t>
       </w:r>
       <w:r>
-        <w:t xml:space="preserve">Neuroticismo, extraversión, apertura, meticulosidad, amabilidad; estables después de los 30; cambios pequeños (N, E y apertura bajan; A y M suben); crítica: «muy limitado» (pp. 400-404).</w:t>
+        <w:t xml:space="preserve">1) Neuroticismo, extraversión, apertura, meticulosidad, amabilidad (p. 401). 2) Bajan N, E y apertura de los 18 a los 30; suben amabilidad y meticulosidad (p. 402). 3) Patrones similares entre culturas; efecto de cohorte en los estudios transversales; la gente cree que cambió más de lo que muestran las mediciones (pp. 402-405).</w:t>
       </w:r>
     </w:p>
     <w:p>
@@ -223,13 +236,13 @@
           <w:b/>
           <w:bCs/>
         </w:rPr>
-        <w:t xml:space="preserve">P3. Autoconcepto (Whitbourne).</w:t>
+        <w:t xml:space="preserve">P3. Whitbourne.</w:t>
       </w:r>
       <w:r>
         <w:t xml:space="preserve"> </w:t>
       </w:r>
       <w:r>
-        <w:t xml:space="preserve">Esquemas, posibles yoes (Markus y Nurius); asimilación y acomodación de identidad; el exceso de cualquiera es poco saludable (pp. 405-406).</w:t>
+        <w:t xml:space="preserve">1) Estilos de identidad. 2) Asimilación: la experiencia se ajusta al yo. 3) Acomodación: el yo se ajusta a la experiencia. 4) El exceso de asimilación vuelve ciego; el de acomodación, influenciable (p. 406).</w:t>
       </w:r>
     </w:p>
     <w:p>
@@ -241,13 +254,13 @@
           <w:b/>
           <w:bCs/>
         </w:rPr>
-        <w:t xml:space="preserve">P4. Etapas.</w:t>
+        <w:t xml:space="preserve">P4. Etapas vs. acontecimientos vitales.</w:t>
       </w:r>
       <w:r>
         <w:t xml:space="preserve"> </w:t>
       </w:r>
       <w:r>
-        <w:t xml:space="preserve">Erikson (crisis 6 a 8: intimidad, generatividad, integridad); Vaillant (estudio Grant); Levinson (estructura de vida, transiciones); críticas: muestras masculinas, de élite y de otra cohorte (pp. 407-415).</w:t>
+        <w:t xml:space="preserve">Etapas: cambio normativo por edad (Erikson: generatividad vs. estancamiento); crítica: muestras de hombres blancos de clase media-alta nacidos en 1920-1930 (pp. 407-414). Acontecimientos: eventos normativos y no normativos; la crisis viene por lo inesperado, por el momento o por lo que nunca llega (pp. 415-416).</w:t>
       </w:r>
     </w:p>
     <w:p>
@@ -259,67 +272,13 @@
           <w:b/>
           <w:bCs/>
         </w:rPr>
-        <w:t xml:space="preserve">P5. Acontecimientos de la vida.</w:t>
+        <w:t xml:space="preserve">P5. Género.</w:t>
       </w:r>
       <w:r>
         <w:t xml:space="preserve"> </w:t>
       </w:r>
       <w:r>
-        <w:t xml:space="preserve">Normativos y no normativos; «en tiempo» o «fuera de tiempo» según el reloj social; crisis por lo inesperado, no por la edad; hoy hay menor conciencia de la edad (pp. 415-417).</w:t>
-      </w:r>
-    </w:p>
-    <w:p>
-      <w:pPr>
-        <w:pStyle w:val="BodyText"/>
-      </w:pPr>
-      <w:r>
-        <w:rPr>
-          <w:b/>
-          <w:bCs/>
-        </w:rPr>
-        <w:t xml:space="preserve">P6. Género y personalidad.</w:t>
-      </w:r>
-      <w:r>
-        <w:t xml:space="preserve"> </w:t>
-      </w:r>
-      <w:r>
-        <w:t xml:space="preserve">Estereotipos, roles e identidad de género; masculino, femenino, andrógino, indiferenciado (Bem); teorías de la identidad de género; con la edad tienden a hacerse más flexibles (Jung, Gutmann; evidencia mixta) (pp. 417-421).</w:t>
-      </w:r>
-    </w:p>
-    <w:p>
-      <w:pPr>
-        <w:pStyle w:val="BodyText"/>
-      </w:pPr>
-      <w:r>
-        <w:rPr>
-          <w:b/>
-          <w:bCs/>
-        </w:rPr>
-        <w:t xml:space="preserve">P7. Estudios Mills (Helson).</w:t>
-      </w:r>
-      <w:r>
-        <w:t xml:space="preserve"> </w:t>
-      </w:r>
-      <w:r>
-        <w:t xml:space="preserve">140 mujeres, seguidas más de 30 años; crisis a principios de los 40, más independencia y autoconfianza, florecimiento a los 50; compromiso con carrera o maternidad → más desarrollo; límites: muestra homogénea y de una cohorte (pp. 422-427).</w:t>
-      </w:r>
-    </w:p>
-    <w:p>
-      <w:pPr>
-        <w:pStyle w:val="BodyText"/>
-      </w:pPr>
-      <w:r>
-        <w:rPr>
-          <w:b/>
-          <w:bCs/>
-        </w:rPr>
-        <w:t xml:space="preserve">P8. Síntesis.</w:t>
-      </w:r>
-      <w:r>
-        <w:t xml:space="preserve"> </w:t>
-      </w:r>
-      <w:r>
-        <w:t xml:space="preserve">Estabilidad y cambio no se excluyen; marcos integradores de Costa y McCrae y de Helson; la personalidad cambia de forma predecible de la juventud a la adultez media (pp. 428).</w:t>
+        <w:t xml:space="preserve">Aprendizaje social (observación, imitación, reforzamiento); cognitivo-evolutivas (cuatro etapas, hasta la trascendencia del rol); esquema de género (esquemas modificables pero resistentes); más androginia en la adultez media (pp. 419-421).</w:t>
       </w:r>
     </w:p>
     <w:bookmarkEnd w:id="12"/>
@@ -394,6 +353,56 @@
               <w:jc w:val="left"/>
             </w:pPr>
             <w:r>
+              <w:t xml:space="preserve">Q-sort</w:t>
+            </w:r>
+          </w:p>
+        </w:tc>
+        <w:tc>
+          <w:tcPr/>
+          <w:p>
+            <w:pPr>
+              <w:pStyle w:val="Compact"/>
+              <w:jc w:val="left"/>
+            </w:pPr>
+            <w:r>
+              <w:t xml:space="preserve">Inventario</w:t>
+            </w:r>
+          </w:p>
+        </w:tc>
+        <w:tc>
+          <w:tcPr/>
+          <w:p>
+            <w:pPr>
+              <w:pStyle w:val="Compact"/>
+              <w:jc w:val="left"/>
+            </w:pPr>
+            <w:r>
+              <w:t xml:space="preserve">Ordenar tarjetas según cuánto describen / cuestionario sobre rasgos (diapositivas 4-5)</w:t>
+            </w:r>
+          </w:p>
+        </w:tc>
+      </w:tr>
+      <w:tr>
+        <w:tc>
+          <w:tcPr/>
+          <w:p>
+            <w:pPr>
+              <w:pStyle w:val="Compact"/>
+              <w:jc w:val="left"/>
+            </w:pPr>
+            <w:r>
+              <w:t xml:space="preserve">Temperamento</w:t>
+            </w:r>
+          </w:p>
+        </w:tc>
+        <w:tc>
+          <w:tcPr/>
+          <w:p>
+            <w:pPr>
+              <w:pStyle w:val="Compact"/>
+              <w:jc w:val="left"/>
+            </w:pPr>
+            <w:r>
               <w:t xml:space="preserve">Personalidad</w:t>
             </w:r>
           </w:p>
@@ -406,7 +415,21 @@
               <w:jc w:val="left"/>
             </w:pPr>
             <w:r>
-              <w:t xml:space="preserve">Conducta observable / temperamento</w:t>
+              <w:t xml:space="preserve">Disposición emocional de base genética / patrón más amplio, también moldeado por la experiencia (pp. 395, 398)</w:t>
+            </w:r>
+          </w:p>
+        </w:tc>
+      </w:tr>
+      <w:tr>
+        <w:tc>
+          <w:tcPr/>
+          <w:p>
+            <w:pPr>
+              <w:pStyle w:val="Compact"/>
+              <w:jc w:val="left"/>
+            </w:pPr>
+            <w:r>
+              <w:t xml:space="preserve">Cambio percibido</w:t>
             </w:r>
           </w:p>
         </w:tc>
@@ -418,7 +441,133 @@
               <w:jc w:val="left"/>
             </w:pPr>
             <w:r>
-              <w:t xml:space="preserve">Patrón con estructura interna / lo que la define el conductismo / disposición biológica (pp. 395, 398)</w:t>
+              <w:t xml:space="preserve">Cambio medido</w:t>
+            </w:r>
+          </w:p>
+        </w:tc>
+        <w:tc>
+          <w:tcPr/>
+          <w:p>
+            <w:pPr>
+              <w:pStyle w:val="Compact"/>
+              <w:jc w:val="left"/>
+            </w:pPr>
+            <w:r>
+              <w:t xml:space="preserve">Lo que la persona cree en retrospectiva (mayor) / lo que muestran las pruebas longitudinales (diapositiva 17)</w:t>
+            </w:r>
+          </w:p>
+        </w:tc>
+      </w:tr>
+      <w:tr>
+        <w:tc>
+          <w:tcPr/>
+          <w:p>
+            <w:pPr>
+              <w:pStyle w:val="Compact"/>
+              <w:jc w:val="left"/>
+            </w:pPr>
+            <w:r>
+              <w:t xml:space="preserve">Asimilación</w:t>
+            </w:r>
+          </w:p>
+        </w:tc>
+        <w:tc>
+          <w:tcPr/>
+          <w:p>
+            <w:pPr>
+              <w:pStyle w:val="Compact"/>
+              <w:jc w:val="left"/>
+            </w:pPr>
+            <w:r>
+              <w:t xml:space="preserve">Acomodación</w:t>
+            </w:r>
+          </w:p>
+        </w:tc>
+        <w:tc>
+          <w:tcPr/>
+          <w:p>
+            <w:pPr>
+              <w:pStyle w:val="Compact"/>
+              <w:jc w:val="left"/>
+            </w:pPr>
+            <w:r>
+              <w:t xml:space="preserve">La experiencia se ajusta al yo / el yo se ajusta a la experiencia (p. 406)</w:t>
+            </w:r>
+          </w:p>
+        </w:tc>
+      </w:tr>
+      <w:tr>
+        <w:tc>
+          <w:tcPr/>
+          <w:p>
+            <w:pPr>
+              <w:pStyle w:val="Compact"/>
+              <w:jc w:val="left"/>
+            </w:pPr>
+            <w:r>
+              <w:t xml:space="preserve">Modelo de etapas</w:t>
+            </w:r>
+          </w:p>
+        </w:tc>
+        <w:tc>
+          <w:tcPr/>
+          <w:p>
+            <w:pPr>
+              <w:pStyle w:val="Compact"/>
+              <w:jc w:val="left"/>
+            </w:pPr>
+            <w:r>
+              <w:t xml:space="preserve">Acontecimientos vitales</w:t>
+            </w:r>
+          </w:p>
+        </w:tc>
+        <w:tc>
+          <w:tcPr/>
+          <w:p>
+            <w:pPr>
+              <w:pStyle w:val="Compact"/>
+              <w:jc w:val="left"/>
+            </w:pPr>
+            <w:r>
+              <w:t xml:space="preserve">El cambio llega con la edad / con los eventos y su momento (pp. 407, 416)</w:t>
+            </w:r>
+          </w:p>
+        </w:tc>
+      </w:tr>
+      <w:tr>
+        <w:tc>
+          <w:tcPr/>
+          <w:p>
+            <w:pPr>
+              <w:pStyle w:val="Compact"/>
+              <w:jc w:val="left"/>
+            </w:pPr>
+            <w:r>
+              <w:t xml:space="preserve">Aprendizaje social</w:t>
+            </w:r>
+          </w:p>
+        </w:tc>
+        <w:tc>
+          <w:tcPr/>
+          <w:p>
+            <w:pPr>
+              <w:pStyle w:val="Compact"/>
+              <w:jc w:val="left"/>
+            </w:pPr>
+            <w:r>
+              <w:t xml:space="preserve">Cognitivo-evolutiva / esquema</w:t>
+            </w:r>
+          </w:p>
+        </w:tc>
+        <w:tc>
+          <w:tcPr/>
+          <w:p>
+            <w:pPr>
+              <w:pStyle w:val="Compact"/>
+              <w:jc w:val="left"/>
+            </w:pPr>
+            <w:r>
+              <w:t xml:space="preserve">Aprender del ambiente / construir activamente la noción de género / combina ambas (pp. 419-420)</w:t>
             </w:r>
           </w:p>
         </w:tc>
@@ -456,197 +605,7 @@
               <w:jc w:val="left"/>
             </w:pPr>
             <w:r>
-              <w:t xml:space="preserve">Rasgos heredados o adquiridos, lo que menos cambia / roles, actitudes, hábitos (p. 400)</w:t>
-            </w:r>
-          </w:p>
-        </w:tc>
-      </w:tr>
-      <w:tr>
-        <w:tc>
-          <w:tcPr/>
-          <w:p>
-            <w:pPr>
-              <w:pStyle w:val="Compact"/>
-              <w:jc w:val="left"/>
-            </w:pPr>
-            <w:r>
-              <w:t xml:space="preserve">Biografía objetiva</w:t>
-            </w:r>
-          </w:p>
-        </w:tc>
-        <w:tc>
-          <w:tcPr/>
-          <w:p>
-            <w:pPr>
-              <w:pStyle w:val="Compact"/>
-              <w:jc w:val="left"/>
-            </w:pPr>
-            <w:r>
-              <w:t xml:space="preserve">Autoconcepto</w:t>
-            </w:r>
-          </w:p>
-        </w:tc>
-        <w:tc>
-          <w:tcPr/>
-          <w:p>
-            <w:pPr>
-              <w:pStyle w:val="Compact"/>
-              <w:jc w:val="left"/>
-            </w:pPr>
-            <w:r>
-              <w:t xml:space="preserve">Hechos reales / cómo la persona se ve (p. 400)</w:t>
-            </w:r>
-          </w:p>
-        </w:tc>
-      </w:tr>
-      <w:tr>
-        <w:tc>
-          <w:tcPr/>
-          <w:p>
-            <w:pPr>
-              <w:pStyle w:val="Compact"/>
-              <w:jc w:val="left"/>
-            </w:pPr>
-            <w:r>
-              <w:t xml:space="preserve">Crisis de la adultez media</w:t>
-            </w:r>
-          </w:p>
-        </w:tc>
-        <w:tc>
-          <w:tcPr/>
-          <w:p>
-            <w:pPr>
-              <w:pStyle w:val="Compact"/>
-              <w:jc w:val="left"/>
-            </w:pPr>
-            <w:r>
-              <w:t xml:space="preserve">Transición de la adultez media</w:t>
-            </w:r>
-          </w:p>
-        </w:tc>
-        <w:tc>
-          <w:tcPr/>
-          <w:p>
-            <w:pPr>
-              <w:pStyle w:val="Compact"/>
-              <w:jc w:val="left"/>
-            </w:pPr>
-            <w:r>
-              <w:t xml:space="preserve">Estresante y universal (Jacques, Levinson) / a veces estresante, mayor apoyo empírico (p. 410)</w:t>
-            </w:r>
-          </w:p>
-        </w:tc>
-      </w:tr>
-      <w:tr>
-        <w:tc>
-          <w:tcPr/>
-          <w:p>
-            <w:pPr>
-              <w:pStyle w:val="Compact"/>
-              <w:jc w:val="left"/>
-            </w:pPr>
-            <w:r>
-              <w:t xml:space="preserve">Evento normativo</w:t>
-            </w:r>
-          </w:p>
-        </w:tc>
-        <w:tc>
-          <w:tcPr/>
-          <w:p>
-            <w:pPr>
-              <w:pStyle w:val="Compact"/>
-              <w:jc w:val="left"/>
-            </w:pPr>
-            <w:r>
-              <w:t xml:space="preserve">No normativo</w:t>
-            </w:r>
-          </w:p>
-        </w:tc>
-        <w:tc>
-          <w:tcPr/>
-          <w:p>
-            <w:pPr>
-              <w:pStyle w:val="Compact"/>
-              <w:jc w:val="left"/>
-            </w:pPr>
-            <w:r>
-              <w:t xml:space="preserve">Esperado en el ciclo (paternidad, jubilación) / inesperado (accidente) (p. 416)</w:t>
-            </w:r>
-          </w:p>
-        </w:tc>
-      </w:tr>
-      <w:tr>
-        <w:tc>
-          <w:tcPr/>
-          <w:p>
-            <w:pPr>
-              <w:pStyle w:val="Compact"/>
-              <w:jc w:val="left"/>
-            </w:pPr>
-            <w:r>
-              <w:t xml:space="preserve">Estereotipos</w:t>
-            </w:r>
-          </w:p>
-        </w:tc>
-        <w:tc>
-          <w:tcPr/>
-          <w:p>
-            <w:pPr>
-              <w:pStyle w:val="Compact"/>
-              <w:jc w:val="left"/>
-            </w:pPr>
-            <w:r>
-              <w:t xml:space="preserve">Roles / identidad de género</w:t>
-            </w:r>
-          </w:p>
-        </w:tc>
-        <w:tc>
-          <w:tcPr/>
-          <w:p>
-            <w:pPr>
-              <w:pStyle w:val="Compact"/>
-              <w:jc w:val="left"/>
-            </w:pPr>
-            <w:r>
-              <w:t xml:space="preserve">Generalizaciones / normas culturales / conciencia de ser hombre o mujer (p. 417)</w:t>
-            </w:r>
-          </w:p>
-        </w:tc>
-      </w:tr>
-      <w:tr>
-        <w:tc>
-          <w:tcPr/>
-          <w:p>
-            <w:pPr>
-              <w:pStyle w:val="Compact"/>
-              <w:jc w:val="left"/>
-            </w:pPr>
-            <w:r>
-              <w:t xml:space="preserve">Andrógino</w:t>
-            </w:r>
-          </w:p>
-        </w:tc>
-        <w:tc>
-          <w:tcPr/>
-          <w:p>
-            <w:pPr>
-              <w:pStyle w:val="Compact"/>
-              <w:jc w:val="left"/>
-            </w:pPr>
-            <w:r>
-              <w:t xml:space="preserve">Indiferenciado</w:t>
-            </w:r>
-          </w:p>
-        </w:tc>
-        <w:tc>
-          <w:tcPr/>
-          <w:p>
-            <w:pPr>
-              <w:pStyle w:val="Compact"/>
-              <w:jc w:val="left"/>
-            </w:pPr>
-            <w:r>
-              <w:t xml:space="preserve">Alto en ambas características / bajo en ambas (p. 418)</w:t>
+              <w:t xml:space="preserve">Rasgos, salud, inteligencia (lo que menos cambia) / roles, hábitos, actitudes (p. 400)</w:t>
             </w:r>
           </w:p>
         </w:tc>
@@ -671,7 +630,23 @@
         </w:numPr>
       </w:pPr>
       <w:r>
-        <w:t xml:space="preserve">Estudio Terman: la meticulosidad predice longevidad (Papalia et al., 2009b, pp. 396-397).</w:t>
+        <w:t xml:space="preserve">Eaves, Eysenck y Martin (1989): en gemelos, el ambiente explica</w:t>
+      </w:r>
+      <w:r>
+        <w:t xml:space="preserve"> </w:t>
+      </w:r>
+      <w:r>
+        <w:rPr>
+          <w:b/>
+          <w:bCs/>
+        </w:rPr>
+        <w:t xml:space="preserve">la mitad</w:t>
+      </w:r>
+      <w:r>
+        <w:t xml:space="preserve"> </w:t>
+      </w:r>
+      <w:r>
+        <w:t xml:space="preserve">de la variación de la personalidad (Papalia et al., 2009b, pp. 398-399).</w:t>
       </w:r>
     </w:p>
     <w:p>
@@ -683,7 +658,23 @@
         </w:numPr>
       </w:pPr>
       <w:r>
-        <w:t xml:space="preserve">Estudio de los cinco factores: Baltimore, muestra nacional de más de 10 000 y cinco culturas (pp. 402-403).</w:t>
+        <w:t xml:space="preserve">El temperamento a los 3-6 años y el estilo parental explicaron el optimismo o pesimismo</w:t>
+      </w:r>
+      <w:r>
+        <w:t xml:space="preserve"> </w:t>
+      </w:r>
+      <w:r>
+        <w:rPr>
+          <w:b/>
+          <w:bCs/>
+        </w:rPr>
+        <w:t xml:space="preserve">21 años</w:t>
+      </w:r>
+      <w:r>
+        <w:t xml:space="preserve"> </w:t>
+      </w:r>
+      <w:r>
+        <w:t xml:space="preserve">después (p. 399).</w:t>
       </w:r>
     </w:p>
     <w:p>
@@ -695,7 +686,7 @@
         </w:numPr>
       </w:pPr>
       <w:r>
-        <w:t xml:space="preserve">Estudios Mills: 140 mujeres de las generaciones de 1958 y 1960 (p. 422).</w:t>
+        <w:t xml:space="preserve">Seis elementos de Costa y McCrae: tendencias básicas, influencias externas, adaptaciones específicas, autoconcepto, biografía objetiva y procesos dinámicos (p. 400).</w:t>
       </w:r>
     </w:p>
     <w:bookmarkEnd w:id="14"/>
@@ -713,7 +704,31 @@
         <w:pStyle w:val="FirstParagraph"/>
       </w:pPr>
       <w:r>
-        <w:t xml:space="preserve">Papalia, D. E., Sterns, H. L., Feldman, R. D., &amp; Camp, C. J. (2009b).</w:t>
+        <w:t xml:space="preserve">Cátedra de Psicología Evolutiva. (2026g).</w:t>
+      </w:r>
+      <w:r>
+        <w:t xml:space="preserve"> </w:t>
+      </w:r>
+      <w:r>
+        <w:rPr>
+          <w:i/>
+          <w:iCs/>
+        </w:rPr>
+        <w:t xml:space="preserve">Desarrollo de la personalidad</w:t>
+      </w:r>
+      <w:r>
+        <w:t xml:space="preserve"> </w:t>
+      </w:r>
+      <w:r>
+        <w:t xml:space="preserve">[Diapositivas de clase, unidad 10]. Universidad Favaloro.</w:t>
+      </w:r>
+    </w:p>
+    <w:p>
+      <w:pPr>
+        <w:pStyle w:val="BodyText"/>
+      </w:pPr>
+      <w:r>
+        <w:t xml:space="preserve">Papalia, D. E., Sterns, H. L., Feldman, R. D., &amp; Camp, C. J. (2009b). Desarrollo de la personalidad. En</w:t>
       </w:r>
       <w:r>
         <w:t xml:space="preserve"> </w:t>
@@ -726,7 +741,10 @@
         <w:t xml:space="preserve">Desarrollo del adulto y vejez</w:t>
       </w:r>
       <w:r>
-        <w:t xml:space="preserve">. McGraw Hill Interamericana.</w:t>
+        <w:t xml:space="preserve"> </w:t>
+      </w:r>
+      <w:r>
+        <w:t xml:space="preserve">(cap. 11, pp. 392-430). McGraw Hill Interamericana.</w:t>
       </w:r>
     </w:p>
     <w:bookmarkEnd w:id="15"/>
@@ -748,7 +766,7 @@
         </w:numPr>
       </w:pPr>
       <w:r>
-        <w:t xml:space="preserve">Definí personalidad y distinguila del temperamento.</w:t>
+        <w:t xml:space="preserve">Definí personalidad y explicá qué es la adaptación.</w:t>
       </w:r>
     </w:p>
     <w:p>
@@ -760,7 +778,7 @@
         </w:numPr>
       </w:pPr>
       <w:r>
-        <w:t xml:space="preserve">Los cinco factores y qué dicen de la estabilidad.</w:t>
+        <w:t xml:space="preserve">¿Qué diferencia el Q-sort de un inventario?</w:t>
       </w:r>
     </w:p>
     <w:p>
@@ -772,7 +790,7 @@
         </w:numPr>
       </w:pPr>
       <w:r>
-        <w:t xml:space="preserve">Asimilación y acomodación de identidad (Whitbourne).</w:t>
+        <w:t xml:space="preserve">¿Qué mostraron los estudios de gemelos sobre herencia y ambiente?</w:t>
       </w:r>
     </w:p>
     <w:p>
@@ -784,7 +802,7 @@
         </w:numPr>
       </w:pPr>
       <w:r>
-        <w:t xml:space="preserve">Erikson, Vaillant y Levinson: qué aporta cada uno y sus críticas.</w:t>
+        <w:t xml:space="preserve">¿Cuáles son los cinco factores y cómo cambian con la edad?</w:t>
       </w:r>
     </w:p>
     <w:p>
@@ -796,7 +814,7 @@
         </w:numPr>
       </w:pPr>
       <w:r>
-        <w:t xml:space="preserve">Reloj social y eventos normativos/no normativos.</w:t>
+        <w:t xml:space="preserve">Asimilación y acomodación de identidad: ¿qué pasa con el exceso de cada una?</w:t>
       </w:r>
     </w:p>
     <w:p>
@@ -808,7 +826,7 @@
         </w:numPr>
       </w:pPr>
       <w:r>
-        <w:t xml:space="preserve">Bem: cuatro tipos de identidad de género.</w:t>
+        <w:t xml:space="preserve">¿Qué critica la cátedra a los modelos de etapas?</w:t>
       </w:r>
     </w:p>
     <w:p>
@@ -820,7 +838,19 @@
         </w:numPr>
       </w:pPr>
       <w:r>
-        <w:t xml:space="preserve">¿Qué mostraron los estudios Mills y cuáles son sus límites?</w:t>
+        <w:t xml:space="preserve">Dá un ejemplo de evento normativo «fuera de tiempo» y de uno que nunca ocurre.</w:t>
+      </w:r>
+    </w:p>
+    <w:p>
+      <w:pPr>
+        <w:pStyle w:val="Compact"/>
+        <w:numPr>
+          <w:ilvl w:val="0"/>
+          <w:numId w:val="1002"/>
+        </w:numPr>
+      </w:pPr>
+      <w:r>
+        <w:t xml:space="preserve">Nombrá las cuatro etapas cognitivo-evolutivas del rol de género.</w:t>
       </w:r>
     </w:p>
     <w:bookmarkEnd w:id="16"/>

</xml_diff>